<commit_message>
修正了 TAS2O_Major_Assignments_Package_AI_Enhanced.docx 的固定抬头： Principal 现在是 Henry Michels Teacher 现在是 Carlos Chen 收紧了 TAS2O_Online_Blended_Learning_Evidence_Log_AI_Enhanced.docx： 抬头修正为 Teacher: Carlos Chen Principal: Henry Michels Course Delivery Model: Hybrid Version: 2026-05-12 Evidence storage location 和 Evidence capture frequency 两行语义也已理顺 清理了 TAS2O_Attendance_110_Hour_Evidence_Log_AI_Enhanced.docx： 视觉上的方括号占位已清掉 只保留 To be recorded 这类运行时字段 清理了 TAS2O_Teacher_Daily_Lesson_Log_AI_Enhanced.docx： Class Section 改成 Summer 2026 section Room / Lab 改成 Hybrid classroom / school lab 模板占位已清空 TAS2O_Report_Card_Credit_Reporting_Procedure_AI_Enhanced.docx 之前已经清完，这轮确认仍然是干净的
</commit_message>
<xml_diff>
--- a/02_Assignments_and_Rubrics/TAS2O_Major_Assignments_Package_AI_Enhanced.docx
+++ b/02_Assignments_and_Rubrics/TAS2O_Major_Assignments_Package_AI_Enhanced.docx
@@ -183,13 +183,8 @@
             <w:vAlign w:val="top"/>
           </w:tcPr>
           <w:p>
-            <w:r/>
-            <w:r>
-              <w:rPr>
-                <w:b w:val="0"/>
-                <w:sz w:val="18"/>
-              </w:rPr>
-              <w:t>Carlos Chen</w:t>
+            <w:r>
+              <w:t>Henry Michels</w:t>
             </w:r>
           </w:p>
         </w:tc>
@@ -217,13 +212,8 @@
             <w:vAlign w:val="top"/>
           </w:tcPr>
           <w:p>
-            <w:r/>
-            <w:r>
-              <w:rPr>
-                <w:b w:val="0"/>
-                <w:sz w:val="18"/>
-              </w:rPr>
-              <w:t>Henry Michels</w:t>
+            <w:r>
+              <w:t>Carlos Chen</w:t>
             </w:r>
           </w:p>
         </w:tc>

</xml_diff>